<commit_message>
Docs: expand Help Center (Reports, Inventory, Production, Security) and refresh delivery checklist
- New Help articles: reports overview, custom report builder & scheduling,
  inventory & stock, warehouses & bin management, production workflow, and an
  admin Security & data protection article
- Update 2FA and sign-in articles to reflect org-wide required MFA, MFA-attempt
  throttling, and endpoint rate limiting; note require-MFA is on in config
- Add customer order-history section to the account article
- Contextual help route map for /reports, /inventory, /production
- Regenerate work-completed checklist and user stories DOCX: MFA enabled,
  rate limiting, WAF, encrypted offsite backups, order history, and the full
  Reports & Analytics capability set
</commit_message>
<xml_diff>
--- a/docs/deliverables/MakeReady_User_Stories.docx
+++ b/docs/deliverables/MakeReady_User_Stories.docx
@@ -214,7 +214,7 @@
                 <w:color w:val="475569"/>
                 <w:sz w:val="20"/>
               </w:rPr>
-              <w:t>July 26, 2026</w:t>
+              <w:t>July 27, 2026</w:t>
             </w:r>
           </w:p>
         </w:tc>
@@ -430,7 +430,7 @@
           <w:color w:val="475569"/>
           <w:sz w:val="20"/>
         </w:rPr>
-        <w:t>Toggle forces all users to enroll a second factor</w:t>
+        <w:t>Require-MFA is enabled: all users must enroll a second factor</w:t>
       </w:r>
     </w:p>
     <w:p>
@@ -537,6 +537,95 @@
           <w:sz w:val="20"/>
         </w:rPr>
         <w:t>HSTS, anti-framing, and related headers on every response</w:t>
+      </w:r>
+    </w:p>
+    <w:p>
+      <w:pPr>
+        <w:spacing w:before="120" w:after="40"/>
+      </w:pPr>
+      <w:r>
+        <w:rPr>
+          <w:rFonts w:ascii="Calibri" w:hAnsi="Calibri"/>
+          <w:b w:val="0"/>
+          <w:i w:val="0"/>
+          <w:color w:val="475569"/>
+          <w:sz w:val="21"/>
+        </w:rPr>
+        <w:t xml:space="preserve">As a </w:t>
+      </w:r>
+      <w:r>
+        <w:rPr>
+          <w:rFonts w:ascii="Calibri" w:hAnsi="Calibri"/>
+          <w:b/>
+          <w:i w:val="0"/>
+          <w:color w:val="0F172A"/>
+          <w:sz w:val="21"/>
+        </w:rPr>
+        <w:t>administrator</w:t>
+      </w:r>
+      <w:r>
+        <w:rPr>
+          <w:rFonts w:ascii="Calibri" w:hAnsi="Calibri"/>
+          <w:b w:val="0"/>
+          <w:i w:val="0"/>
+          <w:color w:val="475569"/>
+          <w:sz w:val="21"/>
+        </w:rPr>
+        <w:t xml:space="preserve">, I want </w:t>
+      </w:r>
+      <w:r>
+        <w:rPr>
+          <w:rFonts w:ascii="Calibri" w:hAnsi="Calibri"/>
+          <w:b/>
+          <w:i w:val="0"/>
+          <w:color w:val="0F172A"/>
+          <w:sz w:val="21"/>
+        </w:rPr>
+        <w:t>brute-force and flooding to be throttled and data to be recoverable</w:t>
+      </w:r>
+      <w:r>
+        <w:rPr>
+          <w:rFonts w:ascii="Calibri" w:hAnsi="Calibri"/>
+          <w:b w:val="0"/>
+          <w:i w:val="0"/>
+          <w:color w:val="475569"/>
+          <w:sz w:val="21"/>
+        </w:rPr>
+        <w:t>, so that the platform resists attacks and I can recover from a disaster.</w:t>
+      </w:r>
+    </w:p>
+    <w:p>
+      <w:pPr>
+        <w:pStyle w:val="ListBullet"/>
+        <w:spacing w:after="20"/>
+        <w:ind w:left="504"/>
+      </w:pPr>
+      <w:r>
+        <w:rPr>
+          <w:rFonts w:ascii="Calibri" w:hAnsi="Calibri"/>
+          <w:b w:val="0"/>
+          <w:i w:val="0"/>
+          <w:color w:val="475569"/>
+          <w:sz w:val="20"/>
+        </w:rPr>
+        <w:t>Rate limiting on sign-in/reset/MFA in the app and a Vercel WAF rule at the edge</w:t>
+      </w:r>
+    </w:p>
+    <w:p>
+      <w:pPr>
+        <w:pStyle w:val="ListBullet"/>
+        <w:spacing w:after="20"/>
+        <w:ind w:left="504"/>
+      </w:pPr>
+      <w:r>
+        <w:rPr>
+          <w:rFonts w:ascii="Calibri" w:hAnsi="Calibri"/>
+          <w:b w:val="0"/>
+          <w:i w:val="0"/>
+          <w:color w:val="475569"/>
+          <w:sz w:val="20"/>
+        </w:rPr>
+        <w:t>Nightly AES-256 encrypted offsite backups (30-day retention) plus Neon point-in-time restore</w:t>
       </w:r>
     </w:p>
     <w:p>
@@ -819,6 +908,95 @@
           <w:sz w:val="20"/>
         </w:rPr>
         <w:t>A BP number is assigned automatically</w:t>
+      </w:r>
+    </w:p>
+    <w:p>
+      <w:pPr>
+        <w:spacing w:before="120" w:after="40"/>
+      </w:pPr>
+      <w:r>
+        <w:rPr>
+          <w:rFonts w:ascii="Calibri" w:hAnsi="Calibri"/>
+          <w:b w:val="0"/>
+          <w:i w:val="0"/>
+          <w:color w:val="475569"/>
+          <w:sz w:val="21"/>
+        </w:rPr>
+        <w:t xml:space="preserve">As a </w:t>
+      </w:r>
+      <w:r>
+        <w:rPr>
+          <w:rFonts w:ascii="Calibri" w:hAnsi="Calibri"/>
+          <w:b/>
+          <w:i w:val="0"/>
+          <w:color w:val="0F172A"/>
+          <w:sz w:val="21"/>
+        </w:rPr>
+        <w:t>account manager</w:t>
+      </w:r>
+      <w:r>
+        <w:rPr>
+          <w:rFonts w:ascii="Calibri" w:hAnsi="Calibri"/>
+          <w:b w:val="0"/>
+          <w:i w:val="0"/>
+          <w:color w:val="475569"/>
+          <w:sz w:val="21"/>
+        </w:rPr>
+        <w:t xml:space="preserve">, I want </w:t>
+      </w:r>
+      <w:r>
+        <w:rPr>
+          <w:rFonts w:ascii="Calibri" w:hAnsi="Calibri"/>
+          <w:b/>
+          <w:i w:val="0"/>
+          <w:color w:val="0F172A"/>
+          <w:sz w:val="21"/>
+        </w:rPr>
+        <w:t>see a customer's full order history on their account</w:t>
+      </w:r>
+      <w:r>
+        <w:rPr>
+          <w:rFonts w:ascii="Calibri" w:hAnsi="Calibri"/>
+          <w:b w:val="0"/>
+          <w:i w:val="0"/>
+          <w:color w:val="475569"/>
+          <w:sz w:val="21"/>
+        </w:rPr>
+        <w:t>, so that I know their stage, value, and lifetime spend at a glance.</w:t>
+      </w:r>
+    </w:p>
+    <w:p>
+      <w:pPr>
+        <w:pStyle w:val="ListBullet"/>
+        <w:spacing w:after="20"/>
+        <w:ind w:left="504"/>
+      </w:pPr>
+      <w:r>
+        <w:rPr>
+          <w:rFonts w:ascii="Calibri" w:hAnsi="Calibri"/>
+          <w:b w:val="0"/>
+          <w:i w:val="0"/>
+          <w:color w:val="475569"/>
+          <w:sz w:val="20"/>
+        </w:rPr>
+        <w:t>Order history card lists each order (number, stage, in-hands, date, value)</w:t>
+      </w:r>
+    </w:p>
+    <w:p>
+      <w:pPr>
+        <w:pStyle w:val="ListBullet"/>
+        <w:spacing w:after="20"/>
+        <w:ind w:left="504"/>
+      </w:pPr>
+      <w:r>
+        <w:rPr>
+          <w:rFonts w:ascii="Calibri" w:hAnsi="Calibri"/>
+          <w:b w:val="0"/>
+          <w:i w:val="0"/>
+          <w:color w:val="475569"/>
+          <w:sz w:val="20"/>
+        </w:rPr>
+        <w:t>Lifetime order count and total; voided orders excluded; pulled live from the database</w:t>
       </w:r>
     </w:p>
     <w:p>
@@ -1855,6 +2033,288 @@
           <w:color w:val="0F172A"/>
           <w:sz w:val="28"/>
         </w:rPr>
+        <w:t>Reports &amp; Analytics</w:t>
+      </w:r>
+    </w:p>
+    <w:p>
+      <w:pPr>
+        <w:spacing w:before="120" w:after="40"/>
+      </w:pPr>
+      <w:r>
+        <w:rPr>
+          <w:rFonts w:ascii="Calibri" w:hAnsi="Calibri"/>
+          <w:b w:val="0"/>
+          <w:i w:val="0"/>
+          <w:color w:val="475569"/>
+          <w:sz w:val="21"/>
+        </w:rPr>
+        <w:t xml:space="preserve">As a </w:t>
+      </w:r>
+      <w:r>
+        <w:rPr>
+          <w:rFonts w:ascii="Calibri" w:hAnsi="Calibri"/>
+          <w:b/>
+          <w:i w:val="0"/>
+          <w:color w:val="0F172A"/>
+          <w:sz w:val="21"/>
+        </w:rPr>
+        <w:t>executive</w:t>
+      </w:r>
+      <w:r>
+        <w:rPr>
+          <w:rFonts w:ascii="Calibri" w:hAnsi="Calibri"/>
+          <w:b w:val="0"/>
+          <w:i w:val="0"/>
+          <w:color w:val="475569"/>
+          <w:sz w:val="21"/>
+        </w:rPr>
+        <w:t xml:space="preserve">, I want </w:t>
+      </w:r>
+      <w:r>
+        <w:rPr>
+          <w:rFonts w:ascii="Calibri" w:hAnsi="Calibri"/>
+          <w:b/>
+          <w:i w:val="0"/>
+          <w:color w:val="0F172A"/>
+          <w:sz w:val="21"/>
+        </w:rPr>
+        <w:t>an at-a-glance dashboard of the business</w:t>
+      </w:r>
+      <w:r>
+        <w:rPr>
+          <w:rFonts w:ascii="Calibri" w:hAnsi="Calibri"/>
+          <w:b w:val="0"/>
+          <w:i w:val="0"/>
+          <w:color w:val="475569"/>
+          <w:sz w:val="21"/>
+        </w:rPr>
+        <w:t>, so that I can see pipeline, sales, and inventory health without digging.</w:t>
+      </w:r>
+    </w:p>
+    <w:p>
+      <w:pPr>
+        <w:pStyle w:val="ListBullet"/>
+        <w:spacing w:after="20"/>
+        <w:ind w:left="504"/>
+      </w:pPr>
+      <w:r>
+        <w:rPr>
+          <w:rFonts w:ascii="Calibri" w:hAnsi="Calibri"/>
+          <w:b w:val="0"/>
+          <w:i w:val="0"/>
+          <w:color w:val="475569"/>
+          <w:sz w:val="20"/>
+        </w:rPr>
+        <w:t>Headline KPIs plus value-labeled charts on real data</w:t>
+      </w:r>
+    </w:p>
+    <w:p>
+      <w:pPr>
+        <w:pStyle w:val="ListBullet"/>
+        <w:spacing w:after="20"/>
+        <w:ind w:left="504"/>
+      </w:pPr>
+      <w:r>
+        <w:rPr>
+          <w:rFonts w:ascii="Calibri" w:hAnsi="Calibri"/>
+          <w:b w:val="0"/>
+          <w:i w:val="0"/>
+          <w:color w:val="475569"/>
+          <w:sz w:val="20"/>
+        </w:rPr>
+        <w:t>Written breakdowns with CSV export</w:t>
+      </w:r>
+    </w:p>
+    <w:p>
+      <w:pPr>
+        <w:spacing w:before="120" w:after="40"/>
+      </w:pPr>
+      <w:r>
+        <w:rPr>
+          <w:rFonts w:ascii="Calibri" w:hAnsi="Calibri"/>
+          <w:b w:val="0"/>
+          <w:i w:val="0"/>
+          <w:color w:val="475569"/>
+          <w:sz w:val="21"/>
+        </w:rPr>
+        <w:t xml:space="preserve">As a </w:t>
+      </w:r>
+      <w:r>
+        <w:rPr>
+          <w:rFonts w:ascii="Calibri" w:hAnsi="Calibri"/>
+          <w:b/>
+          <w:i w:val="0"/>
+          <w:color w:val="0F172A"/>
+          <w:sz w:val="21"/>
+        </w:rPr>
+        <w:t>sales manager</w:t>
+      </w:r>
+      <w:r>
+        <w:rPr>
+          <w:rFonts w:ascii="Calibri" w:hAnsi="Calibri"/>
+          <w:b w:val="0"/>
+          <w:i w:val="0"/>
+          <w:color w:val="475569"/>
+          <w:sz w:val="21"/>
+        </w:rPr>
+        <w:t xml:space="preserve">, I want </w:t>
+      </w:r>
+      <w:r>
+        <w:rPr>
+          <w:rFonts w:ascii="Calibri" w:hAnsi="Calibri"/>
+          <w:b/>
+          <w:i w:val="0"/>
+          <w:color w:val="0F172A"/>
+          <w:sz w:val="21"/>
+        </w:rPr>
+        <w:t>build, save, and export my own reports</w:t>
+      </w:r>
+      <w:r>
+        <w:rPr>
+          <w:rFonts w:ascii="Calibri" w:hAnsi="Calibri"/>
+          <w:b w:val="0"/>
+          <w:i w:val="0"/>
+          <w:color w:val="475569"/>
+          <w:sz w:val="21"/>
+        </w:rPr>
+        <w:t>, so that I get exactly the view I need, like Crystal Reports.</w:t>
+      </w:r>
+    </w:p>
+    <w:p>
+      <w:pPr>
+        <w:pStyle w:val="ListBullet"/>
+        <w:spacing w:after="20"/>
+        <w:ind w:left="504"/>
+      </w:pPr>
+      <w:r>
+        <w:rPr>
+          <w:rFonts w:ascii="Calibri" w:hAnsi="Calibri"/>
+          <w:b w:val="0"/>
+          <w:i w:val="0"/>
+          <w:color w:val="475569"/>
+          <w:sz w:val="20"/>
+        </w:rPr>
+        <w:t>Pick a source, columns, safe filters, group-by with subtotals and grand total</w:t>
+      </w:r>
+    </w:p>
+    <w:p>
+      <w:pPr>
+        <w:pStyle w:val="ListBullet"/>
+        <w:spacing w:after="20"/>
+        <w:ind w:left="504"/>
+      </w:pPr>
+      <w:r>
+        <w:rPr>
+          <w:rFonts w:ascii="Calibri" w:hAnsi="Calibri"/>
+          <w:b w:val="0"/>
+          <w:i w:val="0"/>
+          <w:color w:val="475569"/>
+          <w:sz w:val="20"/>
+        </w:rPr>
+        <w:t>Export to CSV or formatted PDF; live preview; role-gated</w:t>
+      </w:r>
+    </w:p>
+    <w:p>
+      <w:pPr>
+        <w:spacing w:before="120" w:after="40"/>
+      </w:pPr>
+      <w:r>
+        <w:rPr>
+          <w:rFonts w:ascii="Calibri" w:hAnsi="Calibri"/>
+          <w:b w:val="0"/>
+          <w:i w:val="0"/>
+          <w:color w:val="475569"/>
+          <w:sz w:val="21"/>
+        </w:rPr>
+        <w:t xml:space="preserve">As a </w:t>
+      </w:r>
+      <w:r>
+        <w:rPr>
+          <w:rFonts w:ascii="Calibri" w:hAnsi="Calibri"/>
+          <w:b/>
+          <w:i w:val="0"/>
+          <w:color w:val="0F172A"/>
+          <w:sz w:val="21"/>
+        </w:rPr>
+        <w:t>finance user</w:t>
+      </w:r>
+      <w:r>
+        <w:rPr>
+          <w:rFonts w:ascii="Calibri" w:hAnsi="Calibri"/>
+          <w:b w:val="0"/>
+          <w:i w:val="0"/>
+          <w:color w:val="475569"/>
+          <w:sz w:val="21"/>
+        </w:rPr>
+        <w:t xml:space="preserve">, I want </w:t>
+      </w:r>
+      <w:r>
+        <w:rPr>
+          <w:rFonts w:ascii="Calibri" w:hAnsi="Calibri"/>
+          <w:b/>
+          <w:i w:val="0"/>
+          <w:color w:val="0F172A"/>
+          <w:sz w:val="21"/>
+        </w:rPr>
+        <w:t>have key reports emailed on a schedule</w:t>
+      </w:r>
+      <w:r>
+        <w:rPr>
+          <w:rFonts w:ascii="Calibri" w:hAnsi="Calibri"/>
+          <w:b w:val="0"/>
+          <w:i w:val="0"/>
+          <w:color w:val="475569"/>
+          <w:sz w:val="21"/>
+        </w:rPr>
+        <w:t>, so that the numbers arrive without anyone remembering to run them.</w:t>
+      </w:r>
+    </w:p>
+    <w:p>
+      <w:pPr>
+        <w:pStyle w:val="ListBullet"/>
+        <w:spacing w:after="20"/>
+        <w:ind w:left="504"/>
+      </w:pPr>
+      <w:r>
+        <w:rPr>
+          <w:rFonts w:ascii="Calibri" w:hAnsi="Calibri"/>
+          <w:b w:val="0"/>
+          <w:i w:val="0"/>
+          <w:color w:val="475569"/>
+          <w:sz w:val="20"/>
+        </w:rPr>
+        <w:t>Daily/weekly/monthly delivery of CSV or PDF to a recipient list</w:t>
+      </w:r>
+    </w:p>
+    <w:p>
+      <w:pPr>
+        <w:pStyle w:val="ListBullet"/>
+        <w:spacing w:after="20"/>
+        <w:ind w:left="504"/>
+      </w:pPr>
+      <w:r>
+        <w:rPr>
+          <w:rFonts w:ascii="Calibri" w:hAnsi="Calibri"/>
+          <w:b w:val="0"/>
+          <w:i w:val="0"/>
+          <w:color w:val="475569"/>
+          <w:sz w:val="20"/>
+        </w:rPr>
+        <w:t>Seeded KPI reports and scorecards ready to run or schedule</w:t>
+      </w:r>
+    </w:p>
+    <w:p>
+      <w:pPr>
+        <w:keepNext/>
+        <w:spacing w:before="360" w:after="160"/>
+      </w:pPr>
+      <w:r>
+        <w:rPr>
+          <w:rFonts w:ascii="Calibri" w:hAnsi="Calibri"/>
+          <w:b/>
+          <w:color w:val="0F172A"/>
+          <w:sz w:val="28"/>
+        </w:rPr>
         <w:t>Scheduling &amp; Nurturing</w:t>
       </w:r>
     </w:p>

</xml_diff>

<commit_message>
Docs: add mobile field-sales help article + record mobile/PWA in delivery docs
- New Help Center article 'MakeReady on your phone' (install steps for iOS/
  Android, bottom nav, account quick actions, mobile quoting)
- Work-completed checklist: add Mobile Field-Sales Experience section
- User stories: add a mobile field-sales story; Help count to 35+
</commit_message>
<xml_diff>
--- a/docs/deliverables/MakeReady_User_Stories.docx
+++ b/docs/deliverables/MakeReady_User_Stories.docx
@@ -2315,6 +2315,110 @@
           <w:color w:val="0F172A"/>
           <w:sz w:val="28"/>
         </w:rPr>
+        <w:t>Mobile Field Sales</w:t>
+      </w:r>
+    </w:p>
+    <w:p>
+      <w:pPr>
+        <w:spacing w:before="120" w:after="40"/>
+      </w:pPr>
+      <w:r>
+        <w:rPr>
+          <w:rFonts w:ascii="Calibri" w:hAnsi="Calibri"/>
+          <w:b w:val="0"/>
+          <w:i w:val="0"/>
+          <w:color w:val="475569"/>
+          <w:sz w:val="21"/>
+        </w:rPr>
+        <w:t xml:space="preserve">As a </w:t>
+      </w:r>
+      <w:r>
+        <w:rPr>
+          <w:rFonts w:ascii="Calibri" w:hAnsi="Calibri"/>
+          <w:b/>
+          <w:i w:val="0"/>
+          <w:color w:val="0F172A"/>
+          <w:sz w:val="21"/>
+        </w:rPr>
+        <w:t>field sales rep</w:t>
+      </w:r>
+      <w:r>
+        <w:rPr>
+          <w:rFonts w:ascii="Calibri" w:hAnsi="Calibri"/>
+          <w:b w:val="0"/>
+          <w:i w:val="0"/>
+          <w:color w:val="475569"/>
+          <w:sz w:val="21"/>
+        </w:rPr>
+        <w:t xml:space="preserve">, I want </w:t>
+      </w:r>
+      <w:r>
+        <w:rPr>
+          <w:rFonts w:ascii="Calibri" w:hAnsi="Calibri"/>
+          <w:b/>
+          <w:i w:val="0"/>
+          <w:color w:val="0F172A"/>
+          <w:sz w:val="21"/>
+        </w:rPr>
+        <w:t>run the CRM and orders from my phone</w:t>
+      </w:r>
+      <w:r>
+        <w:rPr>
+          <w:rFonts w:ascii="Calibri" w:hAnsi="Calibri"/>
+          <w:b w:val="0"/>
+          <w:i w:val="0"/>
+          <w:color w:val="475569"/>
+          <w:sz w:val="21"/>
+        </w:rPr>
+        <w:t>, so that I can work accounts and quote from the field.</w:t>
+      </w:r>
+    </w:p>
+    <w:p>
+      <w:pPr>
+        <w:pStyle w:val="ListBullet"/>
+        <w:spacing w:after="20"/>
+        <w:ind w:left="504"/>
+      </w:pPr>
+      <w:r>
+        <w:rPr>
+          <w:rFonts w:ascii="Calibri" w:hAnsi="Calibri"/>
+          <w:b w:val="0"/>
+          <w:i w:val="0"/>
+          <w:color w:val="475569"/>
+          <w:sz w:val="20"/>
+        </w:rPr>
+        <w:t>Installable app with a bottom nav (Home, Accounts, +New, Quotes, Orders)</w:t>
+      </w:r>
+    </w:p>
+    <w:p>
+      <w:pPr>
+        <w:pStyle w:val="ListBullet"/>
+        <w:spacing w:after="20"/>
+        <w:ind w:left="504"/>
+      </w:pPr>
+      <w:r>
+        <w:rPr>
+          <w:rFonts w:ascii="Calibri" w:hAnsi="Calibri"/>
+          <w:b w:val="0"/>
+          <w:i w:val="0"/>
+          <w:color w:val="475569"/>
+          <w:sz w:val="20"/>
+        </w:rPr>
+        <w:t>Card lists, tap-to-call/email, and a mobile quote builder; desktop unchanged</w:t>
+      </w:r>
+    </w:p>
+    <w:p>
+      <w:pPr>
+        <w:keepNext/>
+        <w:spacing w:before="360" w:after="160"/>
+      </w:pPr>
+      <w:r>
+        <w:rPr>
+          <w:rFonts w:ascii="Calibri" w:hAnsi="Calibri"/>
+          <w:b/>
+          <w:color w:val="0F172A"/>
+          <w:sz w:val="28"/>
+        </w:rPr>
         <w:t>Scheduling &amp; Nurturing</w:t>
       </w:r>
     </w:p>

</xml_diff>

<commit_message>
Simplify mobile create actions, rework dashboard, and update docs
- Remove the confusing second floating button: the center + speed-dial is now
  the single create action (New Business Partner + New Quote); CRM/pipeline get
  a compact List/Board toggle instead of a corner FAB
- Dashboard: replace stale 'coming soon' placeholders with live role-aware tiles
  (open quotes/orders, jobs in production, low stock, users/audit) that link
  through, plus a Quick actions panel; tighter 2-up grid that fits a phone
- Help Center: document the speed-dial, kanban touch-drag, calendar agenda,
  card-list tables, the List/Board toggle, and the new dashboard; clarify that a
  customer is a Business Partner
- Delivery checklist + user stories: add the mobile drag/dashboard/layout work
</commit_message>
<xml_diff>
--- a/docs/deliverables/MakeReady_User_Stories.docx
+++ b/docs/deliverables/MakeReady_User_Stories.docx
@@ -2409,6 +2409,95 @@
     </w:p>
     <w:p>
       <w:pPr>
+        <w:spacing w:before="120" w:after="40"/>
+      </w:pPr>
+      <w:r>
+        <w:rPr>
+          <w:rFonts w:ascii="Calibri" w:hAnsi="Calibri"/>
+          <w:b w:val="0"/>
+          <w:i w:val="0"/>
+          <w:color w:val="475569"/>
+          <w:sz w:val="21"/>
+        </w:rPr>
+        <w:t xml:space="preserve">As a </w:t>
+      </w:r>
+      <w:r>
+        <w:rPr>
+          <w:rFonts w:ascii="Calibri" w:hAnsi="Calibri"/>
+          <w:b/>
+          <w:i w:val="0"/>
+          <w:color w:val="0F172A"/>
+          <w:sz w:val="21"/>
+        </w:rPr>
+        <w:t>field sales rep</w:t>
+      </w:r>
+      <w:r>
+        <w:rPr>
+          <w:rFonts w:ascii="Calibri" w:hAnsi="Calibri"/>
+          <w:b w:val="0"/>
+          <w:i w:val="0"/>
+          <w:color w:val="475569"/>
+          <w:sz w:val="21"/>
+        </w:rPr>
+        <w:t xml:space="preserve">, I want </w:t>
+      </w:r>
+      <w:r>
+        <w:rPr>
+          <w:rFonts w:ascii="Calibri" w:hAnsi="Calibri"/>
+          <w:b/>
+          <w:i w:val="0"/>
+          <w:color w:val="0F172A"/>
+          <w:sz w:val="21"/>
+        </w:rPr>
+        <w:t>drag pipeline cards and read live numbers on my phone</w:t>
+      </w:r>
+      <w:r>
+        <w:rPr>
+          <w:rFonts w:ascii="Calibri" w:hAnsi="Calibri"/>
+          <w:b w:val="0"/>
+          <w:i w:val="0"/>
+          <w:color w:val="475569"/>
+          <w:sz w:val="21"/>
+        </w:rPr>
+        <w:t>, so that I can manage stages and get a status read at a glance.</w:t>
+      </w:r>
+    </w:p>
+    <w:p>
+      <w:pPr>
+        <w:pStyle w:val="ListBullet"/>
+        <w:spacing w:after="20"/>
+        <w:ind w:left="504"/>
+      </w:pPr>
+      <w:r>
+        <w:rPr>
+          <w:rFonts w:ascii="Calibri" w:hAnsi="Calibri"/>
+          <w:b w:val="0"/>
+          <w:i w:val="0"/>
+          <w:color w:val="475569"/>
+          <w:sz w:val="20"/>
+        </w:rPr>
+        <w:t>Press-and-hold to drag kanban cards between lanes on touch (pipeline, art, production)</w:t>
+      </w:r>
+    </w:p>
+    <w:p>
+      <w:pPr>
+        <w:pStyle w:val="ListBullet"/>
+        <w:spacing w:after="20"/>
+        <w:ind w:left="504"/>
+      </w:pPr>
+      <w:r>
+        <w:rPr>
+          <w:rFonts w:ascii="Calibri" w:hAnsi="Calibri"/>
+          <w:b w:val="0"/>
+          <w:i w:val="0"/>
+          <w:color w:val="475569"/>
+          <w:sz w:val="20"/>
+        </w:rPr>
+        <w:t>Role-aware dashboard with live tiles and quick actions, sized for a phone</w:t>
+      </w:r>
+    </w:p>
+    <w:p>
+      <w:pPr>
         <w:keepNext/>
         <w:spacing w:before="360" w:after="160"/>
       </w:pPr>

</xml_diff>